<commit_message>
adding media release form in documentation
</commit_message>
<xml_diff>
--- a/source/MySEProject/Documentation/ML 24-25-03 Implement Anomaly Detection Sample_Team Synergy.docx
+++ b/source/MySEProject/Documentation/ML 24-25-03 Implement Anomaly Detection Sample_Team Synergy.docx
@@ -868,6 +868,12 @@
         </w:rPr>
         <w:t>The Spatial Pooler processes these SDRs using columns of simulated cortical neuron to learn spatial features via competitive learning and homeostatic plasticity, filtering noise while preserving semantic similarity. The Temporal Memory then identifies temporal sequences in these spatial patterns, predicting future states through dendritic segment activation. These components are chained in a hierarchical pipeline (Fig.2), where input data flows through an encoder → Spatial Pooler → Temporal Memory, iteratively refining spatial and temporal context over cycles. The system leverages configurable parameters (e.g., column density, inhibition radius) and multi-threaded computation for scalability, enabling continuous online learning of streaming data patterns. This architecture mirrors neocortical layered processing, making HTM particularly suited for real-time anomaly detection, predictive modeling, and temporal sequence learning tasks.</w:t>
       </w:r>
+      <w:r>
+        <w:rPr>
+          <w:lang w:eastAsia="x-none"/>
+        </w:rPr>
+        <w:t>[5]</w:t>
+      </w:r>
     </w:p>
     <w:p>
       <w:pPr>
@@ -2065,6 +2071,12 @@
           <w:noProof/>
         </w:rPr>
         <w:t>We will read and parse time-series sequences from CSV files, trim the sequences by removing leading elements, and display the parsed data for debugging purposes. Finally, the prediction results will be saved to new CSV files.</w:t>
+      </w:r>
+      <w:r>
+        <w:rPr>
+          <w:noProof/>
+        </w:rPr>
+        <w:t>[3]</w:t>
       </w:r>
     </w:p>
     <w:p>
@@ -14535,13 +14547,6 @@
       <w:pPr>
         <w:pStyle w:val="references"/>
         <w:ind w:left="354" w:hanging="354"/>
-        <w:sectPr>
-          <w:type w:val="continuous"/>
-          <w:pgSz w:w="11906" w:h="16838" w:code="9"/>
-          <w:pgMar w:top="1080" w:right="907" w:bottom="1440" w:left="907" w:header="720" w:footer="720" w:gutter="0"/>
-          <w:cols w:num="2" w:space="360"/>
-          <w:docGrid w:linePitch="360"/>
-        </w:sectPr>
       </w:pPr>
       <w:r>
         <w:t xml:space="preserve">NeoCortex forked github repository for Anomaly Detection Sample, Team Synergy: </w:t>
@@ -14558,12 +14563,25 @@
     <w:p>
       <w:pPr>
         <w:pStyle w:val="references"/>
-      </w:pPr>
-      <w:r>
-        <w:t>S. Ahmad &amp; J. Hawkins, "Properties of Sparse Distributed Representations and their Application to Hierarchical Temporal Memory," Frontiers in Computational Neuroscience, 2015</w:t>
-      </w:r>
-      <w:r>
-        <w:t>.</w:t>
+        <w:numPr>
+          <w:ilvl w:val="0"/>
+          <w:numId w:val="0"/>
+        </w:numPr>
+        <w:sectPr>
+          <w:type w:val="continuous"/>
+          <w:pgSz w:w="11906" w:h="16838" w:code="9"/>
+          <w:pgMar w:top="1080" w:right="907" w:bottom="1440" w:left="907" w:header="720" w:footer="720" w:gutter="0"/>
+          <w:cols w:num="2" w:space="360"/>
+          <w:docGrid w:linePitch="360"/>
+        </w:sectPr>
+      </w:pPr>
+    </w:p>
+    <w:p>
+      <w:pPr>
+        <w:pStyle w:val="references"/>
+      </w:pPr>
+      <w:r>
+        <w:t>S. Ahmad &amp; J. Hawkins, "Properties of Sparse Distributed Representations and their Application to Hierarchical Temporal Memory," Frontiers in Computational Neuroscience, 2015.</w:t>
       </w:r>
     </w:p>
     <w:p>
@@ -19589,6 +19607,7 @@
   <w:style w:type="character" w:default="1" w:styleId="DefaultParagraphFont">
     <w:name w:val="Default Paragraph Font"/>
     <w:uiPriority w:val="1"/>
+    <w:semiHidden/>
     <w:unhideWhenUsed/>
   </w:style>
   <w:style w:type="table" w:default="1" w:styleId="TableNormal">

</xml_diff>